<commit_message>
feat: remove obsolete DOCX files from the repository
</commit_message>
<xml_diff>
--- a/โครงงาน/10 บทที่ 3.docx
+++ b/โครงงาน/10 บทที่ 3.docx
@@ -166,13 +166,19 @@
         <w:ind w:firstLine="0"/>
         <w:rPr>
           <w:rFonts w:cs="TH Sarabun New"/>
-          <w:szCs w:val="32"/>
+          <w:b/>
+          <w:bCs/>
+          <w:sz w:val="36"/>
+          <w:szCs w:val="36"/>
         </w:rPr>
       </w:pPr>
       <w:r>
         <w:rPr>
           <w:rFonts w:cs="TH Sarabun New"/>
-          <w:szCs w:val="32"/>
+          <w:b/>
+          <w:bCs/>
+          <w:sz w:val="36"/>
+          <w:szCs w:val="36"/>
         </w:rPr>
         <w:t>3.1 Use Case Diagram</w:t>
       </w:r>
@@ -213,13 +219,19 @@
         <w:ind w:firstLine="0"/>
         <w:rPr>
           <w:rFonts w:cs="TH Sarabun New"/>
-          <w:szCs w:val="32"/>
+          <w:b/>
+          <w:bCs/>
+          <w:sz w:val="36"/>
+          <w:szCs w:val="36"/>
         </w:rPr>
       </w:pPr>
       <w:r>
         <w:rPr>
           <w:rFonts w:cs="TH Sarabun New"/>
-          <w:szCs w:val="32"/>
+          <w:b/>
+          <w:bCs/>
+          <w:sz w:val="36"/>
+          <w:szCs w:val="36"/>
         </w:rPr>
         <w:t>3.2 Use Case Description</w:t>
       </w:r>
@@ -229,13 +241,19 @@
         <w:ind w:firstLine="0"/>
         <w:rPr>
           <w:rFonts w:cs="TH Sarabun New"/>
-          <w:szCs w:val="32"/>
+          <w:b/>
+          <w:bCs/>
+          <w:sz w:val="36"/>
+          <w:szCs w:val="36"/>
         </w:rPr>
       </w:pPr>
       <w:r>
         <w:rPr>
           <w:rFonts w:cs="TH Sarabun New"/>
-          <w:szCs w:val="32"/>
+          <w:b/>
+          <w:bCs/>
+          <w:sz w:val="36"/>
+          <w:szCs w:val="36"/>
         </w:rPr>
         <w:t>3.3 Activity Diagram</w:t>
       </w:r>
@@ -243,7 +261,7 @@
     <w:p>
       <w:pPr>
         <w:rPr>
-          <w:rFonts w:cs="TH Sarabun New" w:hint="cs"/>
+          <w:rFonts w:cs="TH Sarabun New"/>
           <w:szCs w:val="32"/>
           <w:cs/>
         </w:rPr>
@@ -315,20 +333,29 @@
         <w:ind w:firstLine="0"/>
         <w:rPr>
           <w:rFonts w:cs="TH Sarabun New"/>
-          <w:szCs w:val="32"/>
+          <w:b/>
+          <w:bCs/>
+          <w:sz w:val="36"/>
+          <w:szCs w:val="36"/>
         </w:rPr>
       </w:pPr>
       <w:r>
         <w:rPr>
           <w:rFonts w:cs="TH Sarabun New"/>
-          <w:szCs w:val="32"/>
+          <w:b/>
+          <w:bCs/>
+          <w:sz w:val="36"/>
+          <w:szCs w:val="36"/>
         </w:rPr>
         <w:t xml:space="preserve">3.4 Sequence </w:t>
       </w:r>
       <w:r>
         <w:rPr>
           <w:rFonts w:cs="TH Sarabun New"/>
-          <w:szCs w:val="32"/>
+          <w:b/>
+          <w:bCs/>
+          <w:sz w:val="36"/>
+          <w:szCs w:val="36"/>
         </w:rPr>
         <w:t>Diagram</w:t>
       </w:r>
@@ -441,13 +468,19 @@
         <w:ind w:firstLine="0"/>
         <w:rPr>
           <w:rFonts w:cs="TH Sarabun New"/>
-          <w:szCs w:val="32"/>
+          <w:b/>
+          <w:bCs/>
+          <w:sz w:val="36"/>
+          <w:szCs w:val="36"/>
         </w:rPr>
       </w:pPr>
       <w:r>
         <w:rPr>
           <w:rFonts w:cs="TH Sarabun New"/>
-          <w:szCs w:val="32"/>
+          <w:b/>
+          <w:bCs/>
+          <w:sz w:val="36"/>
+          <w:szCs w:val="36"/>
         </w:rPr>
         <w:t>3.5 Class Diagram</w:t>
       </w:r>

</xml_diff>